<commit_message>
L-0526: rebuild crew-working-with-codex (html, docx, pdf) from the merged source with build.py
Claude-Session: https://claude.ai/code/session_01QLY3kk7DCXpucXGu3wSniW
</commit_message>
<xml_diff>
--- a/docs/guides/crew/crew-working-with-codex.docx
+++ b/docs/guides/crew/crew-working-with-codex.docx
@@ -1218,6 +1218,128 @@
           <w:rStyle w:val="SourceText"/>
         </w:rPr>
         <w:t>prereview.overridden</w:t>
+      </w:r>
+      <w:r>
+        <w:rPr/>
+        <w:t xml:space="preserve">. When the verify gate has not passed the tree, the prompt's test receipts keep their </w:t>
+      </w:r>
+      <w:r>
+        <w:rPr>
+          <w:rStyle w:val="SourceText"/>
+        </w:rPr>
+        <w:t>MISSING</w:t>
+      </w:r>
+      <w:r>
+        <w:rPr/>
+        <w:t xml:space="preserve"> and </w:t>
+      </w:r>
+      <w:r>
+        <w:rPr>
+          <w:rStyle w:val="SourceText"/>
+        </w:rPr>
+        <w:t>Gate answer for HEAD</w:t>
+      </w:r>
+      <w:r>
+        <w:rPr/>
+        <w:t xml:space="preserve"> lines and add one line saying such a round runs only under </w:t>
+      </w:r>
+      <w:r>
+        <w:rPr>
+          <w:rStyle w:val="SourceText"/>
+        </w:rPr>
+        <w:t>--allow-unverified</w:t>
+      </w:r>
+      <w:r>
+        <w:rPr/>
+        <w:t xml:space="preserve">, recorded as </w:t>
+      </w:r>
+      <w:r>
+        <w:rPr>
+          <w:rStyle w:val="SourceText"/>
+        </w:rPr>
+        <w:t>gate.overridden</w:t>
+      </w:r>
+      <w:r>
+        <w:rPr/>
+        <w:t xml:space="preserve"> in </w:t>
+      </w:r>
+      <w:r>
+        <w:rPr>
+          <w:rStyle w:val="SourceText"/>
+        </w:rPr>
+        <w:t>review.json</w:t>
+      </w:r>
+      <w:r>
+        <w:rPr/>
+        <w:t xml:space="preserve">, that </w:t>
+      </w:r>
+      <w:r>
+        <w:rPr>
+          <w:rStyle w:val="SourceText"/>
+        </w:rPr>
+        <w:t>/crew:done</w:t>
+      </w:r>
+      <w:r>
+        <w:rPr/>
+        <w:t xml:space="preserve"> still needs a clean gate, and that the missing pass alone is that recorded override, not a defect (T-0101).</w:t>
+      </w:r>
+    </w:p>
+    <w:p>
+      <w:pPr>
+        <w:pStyle w:val="BodyText"/>
+        <w:bidi w:val="0"/>
+        <w:jc w:val="left"/>
+        <w:rPr/>
+      </w:pPr>
+      <w:r>
+        <w:rPr/>
+        <w:t>Once the clone's merge train is armed (</w:t>
+      </w:r>
+      <w:r>
+        <w:rPr>
+          <w:rStyle w:val="SourceText"/>
+        </w:rPr>
+        <w:t>crew_train.py arm</w:t>
+      </w:r>
+      <w:r>
+        <w:rPr/>
+        <w:t xml:space="preserve">), the gate round takes it before any of that linting (L-0526): after the CLEAN receipt and the verify gate, </w:t>
+      </w:r>
+      <w:r>
+        <w:rPr>
+          <w:rStyle w:val="SourceText"/>
+        </w:rPr>
+        <w:t>review_run.py</w:t>
+      </w:r>
+      <w:r>
+        <w:rPr/>
+        <w:t xml:space="preserve"> calls </w:t>
+      </w:r>
+      <w:r>
+        <w:rPr>
+          <w:rStyle w:val="SourceText"/>
+        </w:rPr>
+        <w:t>crew_train.acquire</w:t>
+      </w:r>
+      <w:r>
+        <w:rPr/>
+        <w:t xml:space="preserve">, and a ticket that is waiting behind an overlapping one, must merge its base first, or meets a train it cannot read is refused with exit 6, nothing spent and Codex not launched. An unarmed clone never asks. The prompt also carries a </w:t>
+      </w:r>
+      <w:r>
+        <w:rPr>
+          <w:rStyle w:val="SourceText"/>
+        </w:rPr>
+        <w:t>== Catch-up merges (rerere) ==</w:t>
+      </w:r>
+      <w:r>
+        <w:rPr/>
+        <w:t xml:space="preserve"> block listing every file a catch-up merge replayed from an earlier rerere resolution, so Codex reviews each as a change; a merge log it cannot read is written there as </w:t>
+      </w:r>
+      <w:r>
+        <w:rPr>
+          <w:rStyle w:val="SourceText"/>
+        </w:rPr>
+        <w:t>UNREADABLE</w:t>
       </w:r>
       <w:r>
         <w:rPr/>

</xml_diff>

<commit_message>
L-0712: a gone pin falls back across families, never to Claude by default (crew 1.2.5)
crew_state.resolve_role no longer hard-codes provider "claude" when a pinned
model is unavailable. The fallback model runs on the provider that serves its
family (provider_for_model: gpt-6.1-sol -> codex), a fallback in the author's
family is skipped for the next cross-family provider in qa.order (dev.order
for dev) that answers, and none left is `incomplete` (record INCOMPLETE and
refund) unless the operator explicitly allows same-family (sameFamily label).

/crew:status prints the repo-wide same-family share over every ledger and
marks a ticket line that had a same-family round.

Docs: README, CONFIG, model.md, status.md, crew-providers, the Codex guide and
configuration reference (rebuilt), crew_keys summaries, CHANGELOG, BUDGETS.

Tooling-seam: plugin/crew/hooks/scripts/crew_status.py
Tooling-seam: plugin/crew/commands/status.md
</commit_message>
<xml_diff>
--- a/docs/guides/crew/crew-working-with-codex.docx
+++ b/docs/guides/crew/crew-working-with-codex.docx
@@ -1,6 +1,6 @@
 
 <file path=word/document.xml><?xml version="1.0" encoding="utf-8"?>
-<w:document xmlns:o="urn:schemas-microsoft-com:office:office" xmlns:r="http://schemas.openxmlformats.org/officeDocument/2006/relationships" xmlns:v="urn:schemas-microsoft-com:vml" xmlns:w="http://schemas.openxmlformats.org/wordprocessingml/2006/main" xmlns:w10="urn:schemas-microsoft-com:office:word" xmlns:wp="http://schemas.openxmlformats.org/drawingml/2006/wordprocessingDrawing" xmlns:wps="http://schemas.microsoft.com/office/word/2010/wordprocessingShape" xmlns:wpg="http://schemas.microsoft.com/office/word/2010/wordprocessingGroup" xmlns:mc="http://schemas.openxmlformats.org/markup-compatibility/2006" xmlns:wp14="http://schemas.microsoft.com/office/word/2010/wordprocessingDrawing" xmlns:w14="http://schemas.microsoft.com/office/word/2010/wordml" xmlns:w15="http://schemas.microsoft.com/office/word/2012/wordml" mc:Ignorable="w14 wp14 w15">
+<w:document xmlns:o="urn:schemas-microsoft-com:office:office" xmlns:r="http://schemas.openxmlformats.org/officeDocument/2006/relationships" xmlns:v="urn:schemas-microsoft-com:vml" xmlns:w="http://schemas.openxmlformats.org/wordprocessingml/2006/main" xmlns:w10="urn:schemas-microsoft-com:office:word" xmlns:wp="http://schemas.openxmlformats.org/drawingml/2006/wordprocessingDrawing" xmlns:pic="http://schemas.openxmlformats.org/drawingml/2006/picture" xmlns:wps="http://schemas.microsoft.com/office/word/2010/wordprocessingShape" xmlns:wpg="http://schemas.microsoft.com/office/word/2010/wordprocessingGroup" xmlns:mc="http://schemas.openxmlformats.org/markup-compatibility/2006" xmlns:wp14="http://schemas.microsoft.com/office/word/2010/wordprocessingDrawing" xmlns:w14="http://schemas.microsoft.com/office/word/2010/wordml" xmlns:w15="http://schemas.microsoft.com/office/word/2012/wordml" mc:Ignorable="w14 wp14 w15">
   <w:body>
     <w:p>
       <w:pPr>
@@ -47,9 +47,9 @@
     </w:p>
     <w:tbl>
       <w:tblPr>
-        <w:tblW w:w="4638" w:type="dxa"/>
-        <w:jc w:val="left"/>
-        <w:tblInd w:w="0" w:type="dxa"/>
+        <w:tblW w:w="11339" w:type="dxa"/>
+        <w:jc w:val="left"/>
+        <w:tblInd w:w="28" w:type="dxa"/>
         <w:tblLayout w:type="fixed"/>
         <w:tblCellMar>
           <w:top w:w="28" w:type="dxa"/>
@@ -59,9 +59,9 @@
         </w:tblCellMar>
       </w:tblPr>
       <w:tblGrid>
-        <w:gridCol w:w="1621"/>
-        <w:gridCol w:w="1396"/>
-        <w:gridCol w:w="1621"/>
+        <w:gridCol w:w="3902"/>
+        <w:gridCol w:w="2862"/>
+        <w:gridCol w:w="4575"/>
       </w:tblGrid>
       <w:tr>
         <w:trPr>
@@ -69,7 +69,7 @@
         </w:trPr>
         <w:tc>
           <w:tcPr>
-            <w:tcW w:w="1621" w:type="dxa"/>
+            <w:tcW w:w="3902" w:type="dxa"/>
             <w:tcBorders/>
             <w:vAlign w:val="center"/>
           </w:tcPr>
@@ -91,7 +91,7 @@
         </w:tc>
         <w:tc>
           <w:tcPr>
-            <w:tcW w:w="1396" w:type="dxa"/>
+            <w:tcW w:w="2862" w:type="dxa"/>
             <w:tcBorders/>
             <w:vAlign w:val="center"/>
           </w:tcPr>
@@ -113,7 +113,7 @@
         </w:tc>
         <w:tc>
           <w:tcPr>
-            <w:tcW w:w="1621" w:type="dxa"/>
+            <w:tcW w:w="4575" w:type="dxa"/>
             <w:tcBorders/>
             <w:vAlign w:val="center"/>
           </w:tcPr>
@@ -138,7 +138,7 @@
         <w:trPr/>
         <w:tc>
           <w:tcPr>
-            <w:tcW w:w="1621" w:type="dxa"/>
+            <w:tcW w:w="3902" w:type="dxa"/>
             <w:tcBorders/>
             <w:vAlign w:val="center"/>
           </w:tcPr>
@@ -165,7 +165,7 @@
         </w:tc>
         <w:tc>
           <w:tcPr>
-            <w:tcW w:w="1396" w:type="dxa"/>
+            <w:tcW w:w="2862" w:type="dxa"/>
             <w:tcBorders/>
             <w:vAlign w:val="center"/>
           </w:tcPr>
@@ -202,7 +202,7 @@
         </w:tc>
         <w:tc>
           <w:tcPr>
-            <w:tcW w:w="1621" w:type="dxa"/>
+            <w:tcW w:w="4575" w:type="dxa"/>
             <w:tcBorders/>
             <w:vAlign w:val="center"/>
           </w:tcPr>
@@ -226,7 +226,7 @@
         <w:trPr/>
         <w:tc>
           <w:tcPr>
-            <w:tcW w:w="1621" w:type="dxa"/>
+            <w:tcW w:w="3902" w:type="dxa"/>
             <w:tcBorders/>
             <w:vAlign w:val="center"/>
           </w:tcPr>
@@ -263,7 +263,7 @@
         </w:tc>
         <w:tc>
           <w:tcPr>
-            <w:tcW w:w="1396" w:type="dxa"/>
+            <w:tcW w:w="2862" w:type="dxa"/>
             <w:tcBorders/>
             <w:vAlign w:val="center"/>
           </w:tcPr>
@@ -284,7 +284,7 @@
         </w:tc>
         <w:tc>
           <w:tcPr>
-            <w:tcW w:w="1621" w:type="dxa"/>
+            <w:tcW w:w="4575" w:type="dxa"/>
             <w:tcBorders/>
             <w:vAlign w:val="center"/>
           </w:tcPr>
@@ -314,7 +314,7 @@
         <w:trPr/>
         <w:tc>
           <w:tcPr>
-            <w:tcW w:w="1621" w:type="dxa"/>
+            <w:tcW w:w="3902" w:type="dxa"/>
             <w:tcBorders/>
             <w:vAlign w:val="center"/>
           </w:tcPr>
@@ -335,7 +335,7 @@
         </w:tc>
         <w:tc>
           <w:tcPr>
-            <w:tcW w:w="1396" w:type="dxa"/>
+            <w:tcW w:w="2862" w:type="dxa"/>
             <w:tcBorders/>
             <w:vAlign w:val="center"/>
           </w:tcPr>
@@ -362,7 +362,7 @@
         </w:tc>
         <w:tc>
           <w:tcPr>
-            <w:tcW w:w="1621" w:type="dxa"/>
+            <w:tcW w:w="4575" w:type="dxa"/>
             <w:tcBorders/>
             <w:vAlign w:val="center"/>
           </w:tcPr>
@@ -392,7 +392,7 @@
         <w:trPr/>
         <w:tc>
           <w:tcPr>
-            <w:tcW w:w="1621" w:type="dxa"/>
+            <w:tcW w:w="3902" w:type="dxa"/>
             <w:tcBorders/>
             <w:vAlign w:val="center"/>
           </w:tcPr>
@@ -415,7 +415,7 @@
         </w:tc>
         <w:tc>
           <w:tcPr>
-            <w:tcW w:w="1396" w:type="dxa"/>
+            <w:tcW w:w="2862" w:type="dxa"/>
             <w:tcBorders/>
             <w:vAlign w:val="center"/>
           </w:tcPr>
@@ -436,7 +436,7 @@
         </w:tc>
         <w:tc>
           <w:tcPr>
-            <w:tcW w:w="1621" w:type="dxa"/>
+            <w:tcW w:w="4575" w:type="dxa"/>
             <w:tcBorders/>
             <w:vAlign w:val="center"/>
           </w:tcPr>
@@ -863,6 +863,124 @@
       </w:pPr>
       <w:r>
         <w:rPr/>
+        <w:t>To check that Codex answers before you rely on it, run the probe from anywhere:</w:t>
+      </w:r>
+    </w:p>
+    <w:p>
+      <w:pPr>
+        <w:pStyle w:val="PreformattedText"/>
+        <w:bidi w:val="0"/>
+        <w:jc w:val="left"/>
+        <w:rPr/>
+      </w:pPr>
+      <w:r>
+        <w:rPr>
+          <w:rStyle w:val="SourceText"/>
+        </w:rPr>
+        <w:t>python3 "${CLAUDE_PLUGIN_ROOT}/hooks/scripts/provider_probe.py" codex --root &lt;repo&gt;</w:t>
+      </w:r>
+    </w:p>
+    <w:p>
+      <w:pPr>
+        <w:pStyle w:val="BodyText"/>
+        <w:bidi w:val="0"/>
+        <w:jc w:val="left"/>
+        <w:rPr/>
+      </w:pPr>
+      <w:r>
+        <w:rPr/>
+        <w:t>It makes one real call with the reviewer's own command line (</w:t>
+      </w:r>
+      <w:r>
+        <w:rPr>
+          <w:rStyle w:val="SourceText"/>
+        </w:rPr>
+        <w:t>review_run.command_for</w:t>
+      </w:r>
+      <w:r>
+        <w:rPr/>
+        <w:t xml:space="preserve">, which adds </w:t>
+      </w:r>
+      <w:r>
+        <w:rPr>
+          <w:rStyle w:val="SourceText"/>
+        </w:rPr>
+        <w:t>--skip-git-repo-check</w:t>
+      </w:r>
+      <w:r>
+        <w:rPr/>
+        <w:t xml:space="preserve"> and </w:t>
+      </w:r>
+      <w:r>
+        <w:rPr>
+          <w:rStyle w:val="SourceText"/>
+        </w:rPr>
+        <w:t>-C &lt;repo&gt;</w:t>
+      </w:r>
+      <w:r>
+        <w:rPr/>
+        <w:t xml:space="preserve">) and runs it with the repo root as its working directory, so it does not hit "Not inside a trusted directory" the way a </w:t>
+      </w:r>
+      <w:r>
+        <w:rPr>
+          <w:rStyle w:val="SourceText"/>
+        </w:rPr>
+        <w:t>codex exec</w:t>
+      </w:r>
+      <w:r>
+        <w:rPr/>
+        <w:t xml:space="preserve"> typed in a </w:t>
+      </w:r>
+      <w:r>
+        <w:rPr>
+          <w:rStyle w:val="SourceText"/>
+        </w:rPr>
+        <w:t>/tmp</w:t>
+      </w:r>
+      <w:r>
+        <w:rPr/>
+        <w:t xml:space="preserve"> export does. </w:t>
+      </w:r>
+      <w:r>
+        <w:rPr>
+          <w:rStyle w:val="SourceText"/>
+        </w:rPr>
+        <w:t>codex: ok</w:t>
+      </w:r>
+      <w:r>
+        <w:rPr/>
+        <w:t xml:space="preserve"> is exit 0; </w:t>
+      </w:r>
+      <w:r>
+        <w:rPr>
+          <w:rStyle w:val="SourceText"/>
+        </w:rPr>
+        <w:t>codex: FAILED - &lt;reason&gt;</w:t>
+      </w:r>
+      <w:r>
+        <w:rPr/>
+        <w:t xml:space="preserve"> (a failed call, an incomplete event stream, or a 120 s timeout) is exit 1; </w:t>
+      </w:r>
+      <w:r>
+        <w:rPr>
+          <w:rStyle w:val="SourceText"/>
+        </w:rPr>
+        <w:t>codex: not installed</w:t>
+      </w:r>
+      <w:r>
+        <w:rPr/>
+        <w:t xml:space="preserve"> is exit 2.</w:t>
+      </w:r>
+    </w:p>
+    <w:p>
+      <w:pPr>
+        <w:pStyle w:val="BodyText"/>
+        <w:bidi w:val="0"/>
+        <w:jc w:val="left"/>
+        <w:rPr/>
+      </w:pPr>
+      <w:r>
+        <w:rPr/>
         <w:t xml:space="preserve">If you want named </w:t>
       </w:r>
       <w:r>
@@ -1384,10 +1502,87 @@
         <w:jc w:val="left"/>
         <w:rPr/>
       </w:pPr>
-      <w:bookmarkStart w:id="4" w:name="when-codex-hits-a-usage-limit"/>
+      <w:bookmarkStart w:id="4" w:name="when-a-pinned-codex-model-is-retired"/>
       <w:bookmarkEnd w:id="4"/>
       <w:r>
         <w:rPr/>
+        <w:t>When a Pinned Codex Model Is Retired</w:t>
+      </w:r>
+    </w:p>
+    <w:p>
+      <w:pPr>
+        <w:pStyle w:val="BodyText"/>
+        <w:bidi w:val="0"/>
+        <w:jc w:val="left"/>
+        <w:rPr/>
+      </w:pPr>
+      <w:r>
+        <w:rPr/>
+        <w:t xml:space="preserve">A pin to a model Codex no longer serves falls back to </w:t>
+      </w:r>
+      <w:r>
+        <w:rPr>
+          <w:rStyle w:val="SourceText"/>
+        </w:rPr>
+        <w:t>qa.fallback</w:t>
+      </w:r>
+      <w:r>
+        <w:rPr/>
+        <w:t xml:space="preserve">, and since L-0712 the fallback runs on the provider that serves its family: a </w:t>
+      </w:r>
+      <w:r>
+        <w:rPr>
+          <w:rStyle w:val="SourceText"/>
+        </w:rPr>
+        <w:t>gpt-6.1-sol</w:t>
+      </w:r>
+      <w:r>
+        <w:rPr/>
+        <w:t xml:space="preserve"> fallback dispatches to Codex with that model, not to Claude. A fallback in the author's family (the shipped </w:t>
+      </w:r>
+      <w:r>
+        <w:rPr>
+          <w:rStyle w:val="SourceText"/>
+        </w:rPr>
+        <w:t>claude-sonnet-5</w:t>
+      </w:r>
+      <w:r>
+        <w:rPr/>
+        <w:t xml:space="preserve">, on Claude-written work) is skipped for the next provider in </w:t>
+      </w:r>
+      <w:r>
+        <w:rPr>
+          <w:rStyle w:val="SourceText"/>
+        </w:rPr>
+        <w:t>qa.order</w:t>
+      </w:r>
+      <w:r>
+        <w:rPr/>
+        <w:t xml:space="preserve"> that did not write the diff and answers, such as Kimi. When none answers, the round is INCOMPLETE and refunded rather than spent on a same-family read. </w:t>
+      </w:r>
+      <w:r>
+        <w:rPr>
+          <w:rStyle w:val="SourceText"/>
+        </w:rPr>
+        <w:t>/crew:status</w:t>
+      </w:r>
+      <w:r>
+        <w:rPr/>
+        <w:t xml:space="preserve"> prints the share of same-family rounds across every ticket.</w:t>
+      </w:r>
+    </w:p>
+    <w:p>
+      <w:pPr>
+        <w:pStyle w:val="Heading2"/>
+        <w:bidi w:val="0"/>
+        <w:ind w:hanging="0" w:left="0" w:right="0"/>
+        <w:jc w:val="left"/>
+        <w:rPr/>
+      </w:pPr>
+      <w:bookmarkStart w:id="5" w:name="when-codex-hits-a-usage-limit"/>
+      <w:bookmarkEnd w:id="5"/>
+      <w:r>
+        <w:rPr/>
         <w:t>When Codex Hits a Usage Limit</w:t>
       </w:r>
     </w:p>
@@ -1679,8 +1874,8 @@
         <w:jc w:val="left"/>
         <w:rPr/>
       </w:pPr>
-      <w:bookmarkStart w:id="5" w:name="what-is-proven-and-what-is-only-configur"/>
-      <w:bookmarkEnd w:id="5"/>
+      <w:bookmarkStart w:id="6" w:name="what-is-proven-and-what-is-only-configur"/>
+      <w:bookmarkEnd w:id="6"/>
       <w:r>
         <w:rPr/>
         <w:t>What Is Proven, and What Is Only Configured</w:t>
@@ -2127,8 +2322,8 @@
         <w:jc w:val="left"/>
         <w:rPr/>
       </w:pPr>
-      <w:bookmarkStart w:id="6" w:name="when-codex-is-barred"/>
-      <w:bookmarkEnd w:id="6"/>
+      <w:bookmarkStart w:id="7" w:name="when-codex-is-barred"/>
+      <w:bookmarkEnd w:id="7"/>
       <w:r>
         <w:rPr/>
         <w:t>When Codex Is Barred</w:t>
@@ -2451,7 +2646,7 @@
       <w:start w:val="1"/>
       <w:numFmt w:val="none"/>
       <w:suff w:val="nothing"/>
-      <w:lvlText w:val="%1"/>
+      <w:lvlText w:val=""/>
       <w:lvlJc w:val="left"/>
       <w:pPr>
         <w:tabs>
@@ -2462,10 +2657,10 @@
     </w:lvl>
     <w:lvl w:ilvl="1">
       <w:start w:val="1"/>
+      <w:numFmt w:val="none"/>
       <w:pStyle w:val="Heading2"/>
-      <w:numFmt w:val="none"/>
       <w:suff w:val="nothing"/>
-      <w:lvlText w:val="%2"/>
+      <w:lvlText w:val=""/>
       <w:lvlJc w:val="left"/>
       <w:pPr>
         <w:tabs>
@@ -2476,10 +2671,10 @@
     </w:lvl>
     <w:lvl w:ilvl="2">
       <w:start w:val="1"/>
+      <w:numFmt w:val="none"/>
       <w:pStyle w:val="Heading3"/>
-      <w:numFmt w:val="none"/>
       <w:suff w:val="nothing"/>
-      <w:lvlText w:val="%3"/>
+      <w:lvlText w:val=""/>
       <w:lvlJc w:val="left"/>
       <w:pPr>
         <w:tabs>
@@ -2492,7 +2687,7 @@
       <w:start w:val="1"/>
       <w:numFmt w:val="none"/>
       <w:suff w:val="nothing"/>
-      <w:lvlText w:val="%4"/>
+      <w:lvlText w:val=""/>
       <w:lvlJc w:val="left"/>
       <w:pPr>
         <w:tabs>
@@ -2505,7 +2700,7 @@
       <w:start w:val="1"/>
       <w:numFmt w:val="none"/>
       <w:suff w:val="nothing"/>
-      <w:lvlText w:val="%5"/>
+      <w:lvlText w:val=""/>
       <w:lvlJc w:val="left"/>
       <w:pPr>
         <w:tabs>
@@ -2518,7 +2713,7 @@
       <w:start w:val="1"/>
       <w:numFmt w:val="none"/>
       <w:suff w:val="nothing"/>
-      <w:lvlText w:val="%6"/>
+      <w:lvlText w:val=""/>
       <w:lvlJc w:val="left"/>
       <w:pPr>
         <w:tabs>
@@ -2531,7 +2726,7 @@
       <w:start w:val="1"/>
       <w:numFmt w:val="none"/>
       <w:suff w:val="nothing"/>
-      <w:lvlText w:val="%7"/>
+      <w:lvlText w:val=""/>
       <w:lvlJc w:val="left"/>
       <w:pPr>
         <w:tabs>
@@ -2544,7 +2739,7 @@
       <w:start w:val="1"/>
       <w:numFmt w:val="none"/>
       <w:suff w:val="nothing"/>
-      <w:lvlText w:val="%8"/>
+      <w:lvlText w:val=""/>
       <w:lvlJc w:val="left"/>
       <w:pPr>
         <w:tabs>
@@ -2557,7 +2752,7 @@
       <w:start w:val="1"/>
       <w:numFmt w:val="none"/>
       <w:suff w:val="nothing"/>
-      <w:lvlText w:val="%9"/>
+      <w:lvlText w:val=""/>
       <w:lvlJc w:val="left"/>
       <w:pPr>
         <w:tabs>
@@ -2584,7 +2779,7 @@
   <w:docDefaults>
     <w:rPrDefault>
       <w:rPr>
-        <w:rFonts w:ascii="Liberation Serif" w:hAnsi="Liberation Serif" w:eastAsia="WenQuanYi Zen Hei" w:cs="FreeSans"/>
+        <w:rFonts w:ascii="Liberation Serif" w:hAnsi="Liberation Serif" w:eastAsia="Noto Serif CJK SC" w:cs="Noto Sans Devanagari"/>
         <w:sz w:val="24"/>
         <w:szCs w:val="24"/>
         <w:lang w:val="en-US" w:eastAsia="zh-CN" w:bidi="hi-IN"/>
@@ -2614,7 +2809,7 @@
     </w:rPr>
   </w:style>
   <w:style w:type="paragraph" w:styleId="Heading1">
-    <w:name w:val="Heading 1"/>
+    <w:name w:val="heading 1"/>
     <w:basedOn w:val="Heading"/>
     <w:next w:val="BodyText"/>
     <w:qFormat/>
@@ -2622,7 +2817,6 @@
       <w:spacing w:before="240" w:after="80"/>
     </w:pPr>
     <w:rPr>
-      <w:rFonts w:ascii="Noto Sans" w:hAnsi="Noto Sans"/>
       <w:b/>
       <w:bCs/>
       <w:color w:val="88C0D0"/>
@@ -2631,7 +2825,7 @@
     </w:rPr>
   </w:style>
   <w:style w:type="paragraph" w:styleId="Heading2">
-    <w:name w:val="Heading 2"/>
+    <w:name w:val="heading 2"/>
     <w:basedOn w:val="Heading"/>
     <w:next w:val="BodyText"/>
     <w:qFormat/>
@@ -2644,7 +2838,7 @@
       <w:outlineLvl w:val="1"/>
     </w:pPr>
     <w:rPr>
-      <w:rFonts w:ascii="Liberation Serif" w:hAnsi="Liberation Serif" w:eastAsia="WenQuanYi Zen Hei" w:cs="FreeSans"/>
+      <w:rFonts w:ascii="Liberation Serif" w:hAnsi="Liberation Serif" w:eastAsia="Noto Serif CJK SC" w:cs="Noto Sans Devanagari"/>
       <w:b/>
       <w:bCs/>
       <w:color w:val="88C0D0"/>
@@ -2653,7 +2847,7 @@
     </w:rPr>
   </w:style>
   <w:style w:type="paragraph" w:styleId="Heading3">
-    <w:name w:val="Heading 3"/>
+    <w:name w:val="heading 3"/>
     <w:basedOn w:val="Heading"/>
     <w:next w:val="BodyText"/>
     <w:qFormat/>
@@ -2663,12 +2857,24 @@
       <w:outlineLvl w:val="2"/>
     </w:pPr>
     <w:rPr>
-      <w:rFonts w:ascii="Liberation Serif" w:hAnsi="Liberation Serif" w:eastAsia="WenQuanYi Zen Hei" w:cs="FreeSans"/>
+      <w:rFonts w:ascii="Liberation Serif" w:hAnsi="Liberation Serif" w:eastAsia="Noto Serif CJK SC" w:cs="Noto Sans Devanagari"/>
       <w:b/>
       <w:bCs/>
       <w:color w:val="88C0D0"/>
       <w:sz w:val="26"/>
       <w:szCs w:val="26"/>
+    </w:rPr>
+  </w:style>
+  <w:style w:type="character" w:styleId="EndnoteReference">
+    <w:name w:val="endnote reference"/>
+    <w:rPr>
+      <w:vertAlign w:val="superscript"/>
+    </w:rPr>
+  </w:style>
+  <w:style w:type="character" w:styleId="FootnoteReference">
+    <w:name w:val="footnote reference"/>
+    <w:rPr>
+      <w:vertAlign w:val="superscript"/>
     </w:rPr>
   </w:style>
   <w:style w:type="character" w:styleId="EndnoteCharacters">
@@ -2735,7 +2941,7 @@
     </w:rPr>
   </w:style>
   <w:style w:type="paragraph" w:styleId="EnvelopeReturn">
-    <w:name w:val="Envelope Return"/>
+    <w:name w:val="envelope return"/>
     <w:basedOn w:val="Normal"/>
     <w:pPr/>
     <w:rPr>
@@ -2754,46 +2960,6 @@
       <w:color w:val="ECEFF4"/>
     </w:rPr>
   </w:style>
-  <w:style w:type="paragraph" w:styleId="Footer">
-    <w:name w:val="Footer"/>
-    <w:basedOn w:val="Normal"/>
-    <w:pPr>
-      <w:suppressLineNumbers/>
-      <w:tabs>
-        <w:tab w:val="clear" w:pos="1134"/>
-        <w:tab w:val="center" w:pos="5952" w:leader="none"/>
-        <w:tab w:val="right" w:pos="10771" w:leader="none"/>
-      </w:tabs>
-    </w:pPr>
-    <w:rPr/>
-  </w:style>
-  <w:style w:type="paragraph" w:styleId="Header">
-    <w:name w:val="Header"/>
-    <w:basedOn w:val="Normal"/>
-    <w:pPr>
-      <w:suppressLineNumbers/>
-      <w:tabs>
-        <w:tab w:val="clear" w:pos="1134"/>
-        <w:tab w:val="center" w:pos="5952" w:leader="none"/>
-        <w:tab w:val="right" w:pos="10771" w:leader="none"/>
-      </w:tabs>
-    </w:pPr>
-    <w:rPr/>
-  </w:style>
-  <w:style w:type="paragraph" w:styleId="HeaderandFooter">
-    <w:name w:val="Header and Footer"/>
-    <w:basedOn w:val="Normal"/>
-    <w:qFormat/>
-    <w:pPr>
-      <w:suppressLineNumbers/>
-      <w:tabs>
-        <w:tab w:val="clear" w:pos="1134"/>
-        <w:tab w:val="center" w:pos="5953" w:leader="none"/>
-        <w:tab w:val="right" w:pos="10772" w:leader="none"/>
-      </w:tabs>
-    </w:pPr>
-    <w:rPr/>
-  </w:style>
   <w:style w:type="paragraph" w:styleId="Index">
     <w:name w:val="Index"/>
     <w:basedOn w:val="Normal"/>
@@ -2802,11 +2968,11 @@
       <w:suppressLineNumbers/>
     </w:pPr>
     <w:rPr>
-      <w:rFonts w:cs="FreeSans"/>
+      <w:rFonts w:cs="Noto Sans Devanagari"/>
     </w:rPr>
   </w:style>
   <w:style w:type="paragraph" w:styleId="Caption">
-    <w:name w:val="Caption"/>
+    <w:name w:val="caption"/>
     <w:basedOn w:val="Normal"/>
     <w:qFormat/>
     <w:pPr>
@@ -2814,7 +2980,7 @@
       <w:spacing w:before="120" w:after="120"/>
     </w:pPr>
     <w:rPr>
-      <w:rFonts w:cs="FreeSans"/>
+      <w:rFonts w:cs="Noto Sans Devanagari"/>
       <w:i/>
       <w:iCs/>
       <w:sz w:val="24"/>
@@ -2826,7 +2992,7 @@
     <w:basedOn w:val="BodyText"/>
     <w:pPr/>
     <w:rPr>
-      <w:rFonts w:cs="FreeSans"/>
+      <w:rFonts w:cs="Noto Sans Devanagari"/>
     </w:rPr>
   </w:style>
   <w:style w:type="paragraph" w:styleId="BodyText">
@@ -2868,7 +3034,7 @@
       <w:ind w:left="160" w:right="160"/>
     </w:pPr>
     <w:rPr>
-      <w:rFonts w:ascii="Liberation Mono" w:hAnsi="Liberation Mono" w:eastAsia="Liberation Mono" w:cs="Liberation Mono"/>
+      <w:rFonts w:ascii="Liberation Mono" w:hAnsi="Liberation Mono" w:eastAsia="Noto Sans Mono CJK SC" w:cs="Liberation Mono"/>
       <w:sz w:val="20"/>
       <w:szCs w:val="20"/>
     </w:rPr>
@@ -2899,37 +3065,37 @@
         <a:srgbClr val="000000"/>
       </a:dk1>
       <a:lt1>
-        <a:srgbClr val="ffffff"/>
+        <a:srgbClr val="FFFFFF"/>
       </a:lt1>
       <a:dk2>
         <a:srgbClr val="000000"/>
       </a:dk2>
       <a:lt2>
-        <a:srgbClr val="ffffff"/>
+        <a:srgbClr val="FFFFFF"/>
       </a:lt2>
       <a:accent1>
-        <a:srgbClr val="18a303"/>
+        <a:srgbClr val="18A303"/>
       </a:accent1>
       <a:accent2>
-        <a:srgbClr val="0369a3"/>
+        <a:srgbClr val="0369A3"/>
       </a:accent2>
       <a:accent3>
-        <a:srgbClr val="a33e03"/>
+        <a:srgbClr val="A33E03"/>
       </a:accent3>
       <a:accent4>
-        <a:srgbClr val="8e03a3"/>
+        <a:srgbClr val="8E03A3"/>
       </a:accent4>
       <a:accent5>
-        <a:srgbClr val="c99c00"/>
+        <a:srgbClr val="C99C00"/>
       </a:accent5>
       <a:accent6>
-        <a:srgbClr val="c9211e"/>
+        <a:srgbClr val="C9211E"/>
       </a:accent6>
       <a:hlink>
-        <a:srgbClr val="0000ee"/>
+        <a:srgbClr val="0000EE"/>
       </a:hlink>
       <a:folHlink>
-        <a:srgbClr val="551a8b"/>
+        <a:srgbClr val="551A8B"/>
       </a:folHlink>
     </a:clrScheme>
     <a:fontScheme name="Office">

</xml_diff>

<commit_message>
L-0712 harness: no reviewer is INCOMPLETE and refunded; same-family review is opt-in
review_ledger.py: --no-reviewer --reason (no_reviewer) appends an INCOMPLETE,
refunded entry to 'unreviewed' and changes no round, budget, state or receipt;
reserve(same_family=<reason>) labels the row, a CLEAN receipt copies the label,
and a labelled row is never auto-accepted.

review_run.py: --authors refuses an author-family (or could-not-tell) reviewer
with exit 2 before anything is reserved; --same-family <reason> runs it
labelled. A Codex limit names the next cross-family provider.

review.md: an empty $ELIGIBLE or a Codex limit with nothing cross-family left
is --no-reviewer; step 2c on the author's family only on SAME_FAMILY.

Sabotage: ten L-0712 entries in sabotage_review.py, each red on its test.
</commit_message>
<xml_diff>
--- a/docs/guides/crew/crew-working-with-codex.docx
+++ b/docs/guides/crew/crew-working-with-codex.docx
@@ -1771,7 +1771,7 @@
       </w:r>
       <w:r>
         <w:rPr/>
-        <w:t xml:space="preserve"> the round runs on the Claude reviewer - even when </w:t>
+        <w:t xml:space="preserve"> Codex is skipped - even when </w:t>
       </w:r>
       <w:r>
         <w:rPr>
@@ -1791,7 +1791,27 @@
       </w:r>
       <w:r>
         <w:rPr/>
-        <w:t xml:space="preserve"> - announced as </w:t>
+        <w:t xml:space="preserve"> - with the error quoted, and the round goes to the next cross-family provider. When none is left, no reviewer runs: the outcome is recorded INCOMPLETE and refunded (</w:t>
+      </w:r>
+      <w:r>
+        <w:rPr>
+          <w:rStyle w:val="SourceText"/>
+        </w:rPr>
+        <w:t>review_ledger.py --no-reviewer --reason &lt;why&gt;</w:t>
+      </w:r>
+      <w:r>
+        <w:rPr/>
+        <w:t>), spending no round. A Claude read after a limit runs only when you ask for it (</w:t>
+      </w:r>
+      <w:r>
+        <w:rPr>
+          <w:rStyle w:val="SourceText"/>
+        </w:rPr>
+        <w:t>--same-family "codex limit"</w:t>
+      </w:r>
+      <w:r>
+        <w:rPr/>
+        <w:t xml:space="preserve">, crew 1.2.6), announced as </w:t>
       </w:r>
       <w:r>
         <w:rPr>
@@ -1801,7 +1821,7 @@
       </w:r>
       <w:r>
         <w:rPr/>
-        <w:t xml:space="preserve"> with the error quoted, because it is not an independent review.</w:t>
+        <w:t xml:space="preserve"> and labelled in the ledger, because it is not an independent review.</w:t>
       </w:r>
     </w:p>
     <w:p>

</xml_diff>

<commit_message>
L-0715 PR A: crew 1.2.85 bookkeeping (version, changelog, budgets, guide, code map, graph)
</commit_message>
<xml_diff>
--- a/docs/guides/crew/crew-working-with-codex.docx
+++ b/docs/guides/crew/crew-working-with-codex.docx
@@ -1349,7 +1349,47 @@
       </w:r>
       <w:r>
         <w:rPr/>
-        <w:t xml:space="preserve"> does not override a new finding. A linter that could not run, or could not parse a changed file, reads </w:t>
+        <w:t xml:space="preserve"> does not override a new finding. Rules for finding classes a pattern can express (U+2028 in line protocols, duplicate-key JSON, bare interpreters, unquoted </w:t>
+      </w:r>
+      <w:r>
+        <w:rPr>
+          <w:rStyle w:val="SourceText"/>
+        </w:rPr>
+        <w:t>CLAUDE_PLUGIN_ROOT</w:t>
+      </w:r>
+      <w:r>
+        <w:rPr/>
+        <w:t xml:space="preserve">, tests with no assertion) ship as </w:t>
+      </w:r>
+      <w:r>
+        <w:rPr>
+          <w:rStyle w:val="SourceText"/>
+        </w:rPr>
+        <w:t>plugin/crew/lint/semgrep/crew-classes.yml</w:t>
+      </w:r>
+      <w:r>
+        <w:rPr/>
+        <w:t xml:space="preserve"> (L-0715). They are opt-in: a repo lists the linter in its own </w:t>
+      </w:r>
+      <w:r>
+        <w:rPr>
+          <w:rStyle w:val="SourceText"/>
+        </w:rPr>
+        <w:t>.crew/verify.json</w:t>
+      </w:r>
+      <w:r>
+        <w:rPr/>
+        <w:t xml:space="preserve">, nothing runs by default elsewhere, and they do nothing until the </w:t>
+      </w:r>
+      <w:r>
+        <w:rPr>
+          <w:rStyle w:val="SourceText"/>
+        </w:rPr>
+        <w:t>semgrep</w:t>
+      </w:r>
+      <w:r>
+        <w:rPr/>
+        <w:t xml:space="preserve"> linter kind lands in a second change. Symlink and FIFO opens are not lintable and stay a reviewer probe. A linter that could not run, or could not parse a changed file, reads </w:t>
       </w:r>
       <w:r>
         <w:rPr>

</xml_diff>